<commit_message>
these are the first initials and are updated and pushed without the proper mechanism, all future should follow the proper mechanism
</commit_message>
<xml_diff>
--- a/Microsoft_Club_GIKI_Rulebook.docx
+++ b/Microsoft_Club_GIKI_Rulebook.docx
@@ -748,13 +748,16 @@
         <w:t xml:space="preserve"> </w:t>
       </w:r>
       <w:r>
-        <w:t>This inaugural governance framework was authored and developed by the 2025–2026 Executive</w:t>
+        <w:t>This inaugural governance framework was authored and completed by Hamza Faraz,</w:t>
       </w:r>
       <w:r>
         <w:t xml:space="preserve"> </w:t>
       </w:r>
       <w:r>
-        <w:t>Committee, spearheaded by President Hamza Faraz, to establish a permanent, transparent, and scalable structural foundation for Microsoft Club GIKI.</w:t>
+        <w:t>fifth</w:t>
+      </w:r>
+      <w:r>
+        <w:t xml:space="preserve"> President, Microsoft Club GIKI (2025–2026).</w:t>
       </w:r>
     </w:p>
     <w:p>
@@ -840,7 +843,28 @@
         <w:t>•</w:t>
       </w:r>
       <w:r>
-        <w:t xml:space="preserve">   Equip students to excel in the Microsoft Imagine Cup and prestigious hackathons.</w:t>
+        <w:t xml:space="preserve">   </w:t>
+      </w:r>
+      <w:r>
+        <w:t>Equip students to compete and excel in the Microsoft Imagine Cup</w:t>
+      </w:r>
+      <w:r>
+        <w:t>,</w:t>
+      </w:r>
+      <w:r>
+        <w:t xml:space="preserve"> national</w:t>
+      </w:r>
+      <w:r>
+        <w:t xml:space="preserve"> and inter</w:t>
+      </w:r>
+      <w:r>
+        <w:t>nation</w:t>
+      </w:r>
+      <w:r>
+        <w:t>al</w:t>
+      </w:r>
+      <w:r>
+        <w:t xml:space="preserve"> hackathons.</w:t>
       </w:r>
     </w:p>
     <w:p>
@@ -856,7 +880,10 @@
         <w:t>•</w:t>
       </w:r>
       <w:r>
-        <w:t xml:space="preserve">   Provide the GIKI student body with access to premier Learning &amp; Development opportunities.</w:t>
+        <w:t xml:space="preserve">   </w:t>
+      </w:r>
+      <w:r>
+        <w:t>Provide the GIKI student body with access to high-quality technical education and skill-building opportunities.</w:t>
       </w:r>
     </w:p>
     <w:p>
@@ -872,15 +899,10 @@
         <w:t>•</w:t>
       </w:r>
       <w:r>
-        <w:t xml:space="preserve">   Bridge the gap between students, faculty, and industry via the </w:t>
-      </w:r>
-      <w:proofErr w:type="spellStart"/>
-      <w:r>
-        <w:t>Logikal</w:t>
-      </w:r>
-      <w:proofErr w:type="spellEnd"/>
-      <w:r>
-        <w:t xml:space="preserve"> podcast.</w:t>
+        <w:t xml:space="preserve">   </w:t>
+      </w:r>
+      <w:r>
+        <w:t>Bridge the gap between students, faculty, and industry leaders through digital media and public discourse.</w:t>
       </w:r>
     </w:p>
     <w:p>
@@ -896,7 +918,10 @@
         <w:t>•</w:t>
       </w:r>
       <w:r>
-        <w:t xml:space="preserve">   Foster a developer ecosystem for real-world collaborative projects and open-source contributions.</w:t>
+        <w:t xml:space="preserve">   </w:t>
+      </w:r>
+      <w:r>
+        <w:t>Foster a robust developer ecosystem to build real-world software and contribute to open-source initiatives.</w:t>
       </w:r>
     </w:p>
     <w:p>
@@ -912,37 +937,11 @@
         <w:t>•</w:t>
       </w:r>
       <w:r>
-        <w:t xml:space="preserve">   Promote academic inquiry through the </w:t>
-      </w:r>
-      <w:proofErr w:type="spellStart"/>
-      <w:r>
-        <w:t>Brainees</w:t>
-      </w:r>
-      <w:proofErr w:type="spellEnd"/>
-      <w:r>
-        <w:t xml:space="preserve"> research division.</w:t>
-      </w:r>
-    </w:p>
-    <w:p>
-      <w:pPr>
-        <w:spacing w:before="56" w:after="56"/>
-        <w:ind w:left="453" w:hanging="283"/>
-        <w:jc w:val="both"/>
-      </w:pPr>
-    </w:p>
-    <w:p>
-      <w:pPr>
-        <w:spacing w:before="56" w:after="56"/>
-        <w:ind w:left="453" w:hanging="283"/>
-        <w:jc w:val="both"/>
-      </w:pPr>
-    </w:p>
-    <w:p>
-      <w:pPr>
-        <w:spacing w:before="56" w:after="56"/>
-        <w:ind w:left="453" w:hanging="283"/>
-        <w:jc w:val="both"/>
-      </w:pPr>
+        <w:t xml:space="preserve">   </w:t>
+      </w:r>
+      <w:r>
+        <w:t>Cultivate a culture of academic inquiry and applied technological research.</w:t>
+      </w:r>
     </w:p>
     <w:p>
       <w:pPr>
@@ -1137,11 +1136,6 @@
       <w:r>
         <w:t xml:space="preserve"> output. Core Members lead sub-tasks, and Junior Members focus on skill-building.</w:t>
       </w:r>
-    </w:p>
-    <w:p>
-      <w:pPr>
-        <w:spacing w:after="113"/>
-      </w:pPr>
     </w:p>
     <w:tbl>
       <w:tblPr>
@@ -1290,23 +1284,7 @@
                 <w:sz w:val="18"/>
                 <w:szCs w:val="18"/>
               </w:rPr>
-              <w:t xml:space="preserve">Logistics &amp; management of </w:t>
-            </w:r>
-            <w:proofErr w:type="spellStart"/>
-            <w:r>
-              <w:rPr>
-                <w:sz w:val="18"/>
-                <w:szCs w:val="18"/>
-              </w:rPr>
-              <w:t>Logikal</w:t>
-            </w:r>
-            <w:proofErr w:type="spellEnd"/>
-            <w:r>
-              <w:rPr>
-                <w:sz w:val="18"/>
-                <w:szCs w:val="18"/>
-              </w:rPr>
-              <w:t>, L&amp;D, Marketing &amp; Outreach Wings</w:t>
+              <w:t>Oversees logistics, event execution, and the management of all non-technical wings</w:t>
             </w:r>
           </w:p>
           <w:p>
@@ -1764,8 +1742,90 @@
     <w:p>
       <w:pPr>
         <w:spacing w:before="56" w:after="56"/>
+        <w:ind w:left="453" w:hanging="283"/>
         <w:jc w:val="both"/>
       </w:pPr>
+    </w:p>
+    <w:p>
+      <w:pPr>
+        <w:spacing w:before="56" w:after="56"/>
+        <w:ind w:left="453" w:hanging="283"/>
+        <w:jc w:val="both"/>
+      </w:pPr>
+    </w:p>
+    <w:p>
+      <w:pPr>
+        <w:spacing w:before="56" w:after="56"/>
+        <w:ind w:left="453" w:hanging="283"/>
+        <w:jc w:val="both"/>
+      </w:pPr>
+    </w:p>
+    <w:p>
+      <w:pPr>
+        <w:spacing w:before="56" w:after="56"/>
+        <w:ind w:left="453" w:hanging="283"/>
+        <w:jc w:val="both"/>
+      </w:pPr>
+    </w:p>
+    <w:p>
+      <w:pPr>
+        <w:spacing w:before="283" w:after="113"/>
+        <w:ind w:left="113"/>
+      </w:pPr>
+      <w:r>
+        <w:rPr>
+          <w:b/>
+          <w:bCs/>
+          <w:color w:val="A31F34"/>
+          <w:sz w:val="24"/>
+          <w:szCs w:val="24"/>
+        </w:rPr>
+        <w:lastRenderedPageBreak/>
+        <w:t>§ 2.</w:t>
+      </w:r>
+      <w:r>
+        <w:rPr>
+          <w:b/>
+          <w:bCs/>
+          <w:color w:val="A31F34"/>
+          <w:sz w:val="24"/>
+          <w:szCs w:val="24"/>
+        </w:rPr>
+        <w:t>2</w:t>
+      </w:r>
+      <w:r>
+        <w:rPr>
+          <w:b/>
+          <w:bCs/>
+          <w:color w:val="1F3F6D"/>
+          <w:sz w:val="24"/>
+          <w:szCs w:val="24"/>
+        </w:rPr>
+        <w:t xml:space="preserve">   </w:t>
+      </w:r>
+      <w:r>
+        <w:rPr>
+          <w:b/>
+          <w:bCs/>
+          <w:color w:val="1F3F6D"/>
+          <w:sz w:val="24"/>
+          <w:szCs w:val="24"/>
+        </w:rPr>
+        <w:t>EC Elevation Protocol</w:t>
+      </w:r>
+      <w:r>
+        <w:rPr>
+          <w:b/>
+          <w:bCs/>
+          <w:color w:val="1F3F6D"/>
+          <w:sz w:val="24"/>
+          <w:szCs w:val="24"/>
+        </w:rPr>
+        <w:br/>
+      </w:r>
+      <w:r>
+        <w:t>Executive Committee members are elevated from the Wing Lead tier through a structured selection process conducted at the end of each academic year. Candidates must have served a minimum of one full year as a Wing Lead. The selection process consists of a public speech, a formal interview, and a ranked voting round. The outgoing EC evaluates all candidates based on these inputs and confirms the final selections by a simple majority vote.</w:t>
+      </w:r>
     </w:p>
     <w:p>
       <w:pPr>
@@ -1834,7 +1894,6 @@
           <w:sz w:val="24"/>
           <w:szCs w:val="24"/>
         </w:rPr>
-        <w:lastRenderedPageBreak/>
         <w:t>§ 3.1</w:t>
       </w:r>
       <w:r>
@@ -2016,117 +2075,27 @@
         </w:rPr>
         <w:t xml:space="preserve">   Official Wings</w:t>
       </w:r>
-    </w:p>
-    <w:p>
-      <w:pPr>
-        <w:spacing w:before="56" w:after="56"/>
-        <w:ind w:left="453" w:hanging="283"/>
-        <w:jc w:val="both"/>
-      </w:pPr>
-      <w:r>
-        <w:rPr>
-          <w:color w:val="A31F34"/>
-        </w:rPr>
-        <w:t>•</w:t>
-      </w:r>
-      <w:r>
-        <w:t xml:space="preserve">   Development Wing: Builds community</w:t>
-      </w:r>
-      <w:r>
-        <w:t xml:space="preserve"> or freelance</w:t>
-      </w:r>
-      <w:r>
-        <w:t xml:space="preserve"> software projects.</w:t>
-      </w:r>
-      <w:r>
-        <w:t xml:space="preserve"> </w:t>
-      </w:r>
-      <w:r>
-        <w:t>Provide Long-Term Support (LTS) for active campus systems and mentor juniors for seamless project handoffs.</w:t>
-      </w:r>
-      <w:r>
-        <w:t xml:space="preserve"> (Reports to Dev Director)</w:t>
-      </w:r>
-    </w:p>
-    <w:p>
-      <w:pPr>
-        <w:spacing w:before="56" w:after="56"/>
-        <w:ind w:left="453" w:hanging="283"/>
-        <w:jc w:val="both"/>
-      </w:pPr>
-      <w:r>
-        <w:rPr>
-          <w:color w:val="A31F34"/>
-        </w:rPr>
-        <w:t>•</w:t>
-      </w:r>
-      <w:r>
-        <w:t xml:space="preserve">   Learning &amp; Development (L&amp;D) Wing: Delivers technical sessions. (Reports to Program Manager)</w:t>
-      </w:r>
-    </w:p>
-    <w:p>
-      <w:pPr>
-        <w:spacing w:before="56" w:after="56"/>
-        <w:ind w:left="453" w:hanging="283"/>
-        <w:jc w:val="both"/>
-      </w:pPr>
-      <w:r>
-        <w:rPr>
-          <w:color w:val="A31F34"/>
-        </w:rPr>
-        <w:t>•</w:t>
-      </w:r>
-      <w:r>
-        <w:t xml:space="preserve">  </w:t>
-      </w:r>
-      <w:proofErr w:type="spellStart"/>
-      <w:r>
-        <w:t>Logikal</w:t>
-      </w:r>
-      <w:proofErr w:type="spellEnd"/>
-      <w:r>
-        <w:t xml:space="preserve"> (Podcast Wing): Produces episodes featuring leaders and alumni. (Reports to Program Manager)</w:t>
-      </w:r>
-    </w:p>
-    <w:p>
-      <w:pPr>
-        <w:spacing w:before="56" w:after="56"/>
-        <w:ind w:left="453" w:hanging="283"/>
-        <w:jc w:val="both"/>
-      </w:pPr>
-      <w:r>
-        <w:rPr>
-          <w:color w:val="A31F34"/>
-        </w:rPr>
-        <w:t>•</w:t>
-      </w:r>
-      <w:r>
-        <w:t xml:space="preserve">   Marketing Wing: Manages branding and digital presence.</w:t>
-      </w:r>
-      <w:r>
-        <w:t xml:space="preserve"> </w:t>
-      </w:r>
-      <w:r>
-        <w:t>Drive a 'Building in Public' culture by showcasing technical projects and hackathon milestones on professional platforms.</w:t>
-      </w:r>
-      <w:r>
-        <w:t xml:space="preserve"> (Reports to Program Manager)</w:t>
-      </w:r>
-    </w:p>
-    <w:p>
-      <w:pPr>
-        <w:spacing w:before="56" w:after="56"/>
-        <w:ind w:left="453" w:hanging="283"/>
-        <w:jc w:val="both"/>
-      </w:pPr>
-      <w:r>
-        <w:rPr>
-          <w:color w:val="A31F34"/>
-        </w:rPr>
-        <w:t>•</w:t>
-      </w:r>
-      <w:r>
-        <w:t xml:space="preserve">   Outreach Wing: Secures sponsorships and external partnerships. (Reports to Program Manager)</w:t>
+      <w:r>
+        <w:br/>
+      </w:r>
+      <w:r>
+        <w:t xml:space="preserve">The Club operates through distinct Official Wings, each managed by a Wing Lead and reporting to a designated Executive Committee member. Official Wings represent the permanent operational pillars of the Club. The complete and current roster of Official Wings, along with their reporting structures, shall be maintained in the </w:t>
+      </w:r>
+      <w:r>
+        <w:rPr>
+          <w:b/>
+          <w:bCs/>
+        </w:rPr>
+        <w:t>Active Wings Registry</w:t>
+      </w:r>
+      <w:r>
+        <w:t xml:space="preserve">, a separate </w:t>
+      </w:r>
+      <w:r>
+        <w:t>Google</w:t>
+      </w:r>
+      <w:r>
+        <w:t xml:space="preserve"> doc managed by the Executive Committee.</w:t>
       </w:r>
     </w:p>
     <w:p>
@@ -2154,62 +2123,28 @@
         </w:rPr>
         <w:t xml:space="preserve">   Provisional Wings</w:t>
       </w:r>
-    </w:p>
-    <w:p>
-      <w:pPr>
-        <w:spacing w:before="85" w:after="85"/>
-        <w:ind w:left="113"/>
-        <w:jc w:val="both"/>
-      </w:pPr>
-      <w:r>
-        <w:t>Provisional Wings operate with standard funding and recruitment rights but are undergoing a 2-year probationary cycle.</w:t>
-      </w:r>
-    </w:p>
-    <w:p>
-      <w:pPr>
-        <w:spacing w:before="56" w:after="56"/>
-        <w:ind w:left="453" w:hanging="283"/>
-        <w:jc w:val="both"/>
-      </w:pPr>
-      <w:r>
-        <w:rPr>
-          <w:color w:val="A31F34"/>
-        </w:rPr>
-        <w:t>•</w:t>
-      </w:r>
-      <w:r>
-        <w:t xml:space="preserve">   Competitive Engagement Wing: Trains teams for hackathons. (Undergoing 2-Year Cycle)</w:t>
-      </w:r>
-    </w:p>
-    <w:p>
-      <w:pPr>
-        <w:spacing w:before="56" w:after="56"/>
-        <w:ind w:left="453" w:hanging="283"/>
-        <w:jc w:val="both"/>
-      </w:pPr>
-      <w:r>
-        <w:rPr>
-          <w:color w:val="A31F34"/>
-        </w:rPr>
-        <w:t>•</w:t>
-      </w:r>
-      <w:r>
-        <w:t xml:space="preserve">   </w:t>
-      </w:r>
-      <w:proofErr w:type="spellStart"/>
-      <w:r>
-        <w:t>Brainees</w:t>
-      </w:r>
-      <w:proofErr w:type="spellEnd"/>
-      <w:r>
-        <w:t xml:space="preserve"> (Research Wing): Fosters academic paper writing. (Non-technical; Year 1 of 2)</w:t>
-      </w:r>
-    </w:p>
-    <w:p>
-      <w:pPr>
-        <w:spacing w:before="283" w:after="113"/>
-        <w:ind w:left="113"/>
-      </w:pPr>
+      <w:r>
+        <w:br/>
+      </w:r>
+      <w:r>
+        <w:t xml:space="preserve">Provisional Wings operate with standard funding and recruitment rights but must undergo a mandatory 2-year probationary cycle before being considered for Official Wing status. The current roster and probationary status of all active Provisional Wings shall also be tracked in the </w:t>
+      </w:r>
+      <w:r>
+        <w:rPr>
+          <w:b/>
+          <w:bCs/>
+        </w:rPr>
+        <w:t>Active Wings Registry</w:t>
+      </w:r>
+      <w:r>
+        <w:t>.</w:t>
+      </w:r>
+      <w:r>
+        <w:br/>
+      </w:r>
+      <w:r>
+        <w:br/>
+      </w:r>
       <w:r>
         <w:rPr>
           <w:b/>
@@ -2275,6 +2210,7 @@
           <w:b/>
           <w:bCs/>
         </w:rPr>
+        <w:lastRenderedPageBreak/>
         <w:t>Succession Planning (Year 1 to 2):</w:t>
       </w:r>
       <w:r>
@@ -2296,7 +2232,6 @@
           <w:b/>
           <w:bCs/>
         </w:rPr>
-        <w:lastRenderedPageBreak/>
         <w:t>Exception for Executive Elevation:</w:t>
       </w:r>
       <w:r>
@@ -2358,27 +2293,105 @@
     </w:p>
     <w:p>
       <w:pPr>
+        <w:spacing w:before="283" w:after="113"/>
+        <w:ind w:left="113"/>
+      </w:pPr>
+      <w:r>
+        <w:t xml:space="preserve">Upon elevation, the EC will either establish a dedicated Executive Committee position (e.g., Research Director) to oversee the new </w:t>
+      </w:r>
+      <w:r>
+        <w:t>wing or</w:t>
+      </w:r>
+      <w:r>
+        <w:t xml:space="preserve"> permanently integrate it under the portfolio of an existing EC </w:t>
+      </w:r>
+      <w:r>
+        <w:t>m</w:t>
+      </w:r>
+      <w:r>
+        <w:t>ember</w:t>
+      </w:r>
+      <w:r>
+        <w:t xml:space="preserve"> (e.g., the Program Manager). If the vote does not pass, the EC will work with the wing to determine a one-year extension or a structural pivot.</w:t>
+      </w:r>
+      <w:r>
+        <w:br/>
+      </w:r>
+      <w:r>
+        <w:br/>
+      </w:r>
+      <w:r>
+        <w:rPr>
+          <w:b/>
+          <w:bCs/>
+          <w:color w:val="A31F34"/>
+          <w:sz w:val="24"/>
+          <w:szCs w:val="24"/>
+        </w:rPr>
+        <w:t>§ 4.</w:t>
+      </w:r>
+      <w:r>
+        <w:rPr>
+          <w:b/>
+          <w:bCs/>
+          <w:color w:val="A31F34"/>
+          <w:sz w:val="24"/>
+          <w:szCs w:val="24"/>
+        </w:rPr>
+        <w:t>4</w:t>
+      </w:r>
+      <w:r>
+        <w:rPr>
+          <w:b/>
+          <w:bCs/>
+          <w:color w:val="1F3F6D"/>
+          <w:sz w:val="24"/>
+          <w:szCs w:val="24"/>
+        </w:rPr>
+        <w:t xml:space="preserve">   </w:t>
+      </w:r>
+      <w:r>
+        <w:rPr>
+          <w:b/>
+          <w:bCs/>
+          <w:color w:val="1F3F6D"/>
+          <w:sz w:val="24"/>
+          <w:szCs w:val="24"/>
+        </w:rPr>
+        <w:t>Roster Management</w:t>
+      </w:r>
+    </w:p>
+    <w:p>
+      <w:pPr>
         <w:spacing w:before="85" w:after="85"/>
         <w:ind w:left="113"/>
-        <w:jc w:val="both"/>
-      </w:pPr>
-      <w:r>
-        <w:t xml:space="preserve">Upon elevation, the EC will either establish a dedicated Executive Committee position (e.g., Research Director) to oversee the new </w:t>
-      </w:r>
-      <w:r>
-        <w:t>wing or</w:t>
-      </w:r>
-      <w:r>
-        <w:t xml:space="preserve"> permanently integrate it under the portfolio of an existing EC </w:t>
-      </w:r>
-      <w:r>
-        <w:t>m</w:t>
-      </w:r>
-      <w:r>
-        <w:t>ember</w:t>
-      </w:r>
-      <w:r>
-        <w:t xml:space="preserve"> (e.g., the Program Manager). If the vote does not pass, the EC will work with the wing to determine a one-year extension or a structural pivot.</w:t>
+      </w:pPr>
+      <w:r>
+        <w:t xml:space="preserve">The </w:t>
+      </w:r>
+      <w:r>
+        <w:t>Active Wings Registry</w:t>
+      </w:r>
+      <w:r>
+        <w:t xml:space="preserve"> </w:t>
+      </w:r>
+      <w:r>
+        <w:t xml:space="preserve">reflects the dynamic operational state of the Club. Modifying the Official Wings roster requires a 2/3 supermajority EC vote. Modifying the Provisional Wings roster requires only a simple </w:t>
+      </w:r>
+      <w:r>
+        <w:t>majority of</w:t>
+      </w:r>
+      <w:r>
+        <w:t xml:space="preserve"> EC </w:t>
+      </w:r>
+      <w:r>
+        <w:t>votes</w:t>
+      </w:r>
+      <w:r>
+        <w:t>. Updating this separate roster document does not trigger the formal amendment protocols for this Rulebook outlined in Article XVII.</w:t>
+      </w:r>
+      <w:r>
+        <w:br/>
       </w:r>
     </w:p>
     <w:p>
@@ -2514,7 +2527,6 @@
       <w:pPr>
         <w:spacing w:before="85" w:after="85"/>
         <w:ind w:left="453" w:hanging="340"/>
-        <w:jc w:val="both"/>
       </w:pPr>
       <w:r>
         <w:rPr>
@@ -2526,6 +2538,21 @@
       </w:r>
       <w:r>
         <w:t xml:space="preserve">   To ensure fairness, any rejected candidate may submit a written appeal directly to the President within 5 days.</w:t>
+      </w:r>
+      <w:r>
+        <w:br/>
+      </w:r>
+      <w:r>
+        <w:br/>
+      </w:r>
+      <w:r>
+        <w:br/>
+      </w:r>
+      <w:r>
+        <w:br/>
+      </w:r>
+      <w:r>
+        <w:br/>
       </w:r>
     </w:p>
     <w:p>
@@ -2546,6 +2573,7 @@
           <w:sz w:val="28"/>
           <w:szCs w:val="28"/>
         </w:rPr>
+        <w:lastRenderedPageBreak/>
         <w:t xml:space="preserve">ARTICLE </w:t>
       </w:r>
       <w:r>
@@ -2607,7 +2635,6 @@
         </w:rPr>
         <w:t xml:space="preserve">   </w:t>
       </w:r>
-      <w:proofErr w:type="spellStart"/>
       <w:r>
         <w:rPr>
           <w:b/>
@@ -2616,18 +2643,7 @@
           <w:sz w:val="24"/>
           <w:szCs w:val="24"/>
         </w:rPr>
-        <w:t>Micathon</w:t>
-      </w:r>
-      <w:proofErr w:type="spellEnd"/>
-      <w:r>
-        <w:rPr>
-          <w:b/>
-          <w:bCs/>
-          <w:color w:val="1F3F6D"/>
-          <w:sz w:val="24"/>
-          <w:szCs w:val="24"/>
-        </w:rPr>
-        <w:t xml:space="preserve"> — Flagship Event</w:t>
+        <w:t>Annual Flagship Event</w:t>
       </w:r>
     </w:p>
     <w:p>
@@ -2636,13 +2652,19 @@
         <w:ind w:left="113"/>
         <w:jc w:val="both"/>
       </w:pPr>
+      <w:r>
+        <w:t xml:space="preserve">The Club shall host a flagship intra-university tech competition (e.g., </w:t>
+      </w:r>
       <w:proofErr w:type="spellStart"/>
       <w:r>
         <w:t>Micathon</w:t>
       </w:r>
       <w:proofErr w:type="spellEnd"/>
       <w:r>
-        <w:t xml:space="preserve"> is the Club's flagship intra-university hackathon, held at minimum once annually. A formal post-event report must be submitted to the EC within one week of conclusion.</w:t>
+        <w:t>) at minimum once annually.</w:t>
+      </w:r>
+      <w:r>
+        <w:t xml:space="preserve"> A formal post-event report must be submitted to the EC within one week of conclusion.</w:t>
       </w:r>
     </w:p>
     <w:p>
@@ -2675,7 +2697,6 @@
       <w:pPr>
         <w:spacing w:before="85" w:after="85"/>
         <w:ind w:left="113"/>
-        <w:jc w:val="both"/>
       </w:pPr>
       <w:r>
         <w:t>All events require prior EC approval, a clear budget, and must comply with GIKI regulations. External participation must be reported to the Program Manager.</w:t>
@@ -2779,7 +2800,6 @@
         <w:jc w:val="both"/>
       </w:pPr>
       <w:r>
-        <w:lastRenderedPageBreak/>
         <w:t xml:space="preserve">We recognize that academic and mental health pressures are real. We pledge that no EC member or Wing </w:t>
       </w:r>
       <w:r>
@@ -3028,9 +3048,9 @@
       <w:pPr>
         <w:spacing w:before="85" w:after="85"/>
         <w:ind w:left="113"/>
-        <w:jc w:val="both"/>
-      </w:pPr>
-      <w:r>
+      </w:pPr>
+      <w:r>
+        <w:lastRenderedPageBreak/>
         <w:t xml:space="preserve">No member who in good faith reports a suspected violation of ethical standards, financial misconduct, or policy shall be subject to retaliation. Reports may be made confidentially to </w:t>
       </w:r>
       <w:r>
@@ -3132,17 +3152,39 @@
       <w:pPr>
         <w:spacing w:before="85" w:after="85"/>
         <w:ind w:left="113"/>
-        <w:jc w:val="both"/>
-      </w:pPr>
-      <w:r>
-        <w:t>All club domains, GitHub repositories, cloud credits, and social media accounts are the exclusive property of the Club. They must be registered under official club emails and transferred to incoming officers upon transition.</w:t>
-      </w:r>
-    </w:p>
-    <w:p>
-      <w:pPr>
-        <w:spacing w:before="283" w:after="113"/>
-        <w:ind w:left="113"/>
-      </w:pPr>
+      </w:pPr>
+      <w:r>
+        <w:t>All club domains, source code repositories, cloud infrastructure accounts, and social media profiles</w:t>
+      </w:r>
+      <w:r>
+        <w:t xml:space="preserve"> are the exclusive property of the Club. They must be registered under official club emails and transferred to incoming </w:t>
+      </w:r>
+      <w:r>
+        <w:t>EC members</w:t>
+      </w:r>
+      <w:r>
+        <w:t xml:space="preserve"> upon transition.</w:t>
+      </w:r>
+      <w:r>
+        <w:rPr>
+          <w:b/>
+          <w:bCs/>
+          <w:color w:val="A31F34"/>
+          <w:sz w:val="24"/>
+          <w:szCs w:val="24"/>
+        </w:rPr>
+        <w:br/>
+      </w:r>
+      <w:r>
+        <w:rPr>
+          <w:b/>
+          <w:bCs/>
+          <w:color w:val="A31F34"/>
+          <w:sz w:val="24"/>
+          <w:szCs w:val="24"/>
+        </w:rPr>
+        <w:br/>
+      </w:r>
       <w:r>
         <w:rPr>
           <w:b/>
@@ -3171,7 +3213,6 @@
         <w:jc w:val="both"/>
       </w:pPr>
       <w:r>
-        <w:lastRenderedPageBreak/>
         <w:t>IP created by students for formal 'Club Projects' (e.g., official club software) belongs to the Club. IP created for personal projects, even if mentored by the club, belongs to the individual creator, subject to GIKI regulations on university resources.</w:t>
       </w:r>
     </w:p>
@@ -3406,13 +3447,22 @@
         <w:jc w:val="both"/>
       </w:pPr>
       <w:r>
-        <w:t xml:space="preserve">The </w:t>
-      </w:r>
-      <w:r>
-        <w:t>VP</w:t>
-      </w:r>
-      <w:r>
-        <w:t xml:space="preserve"> oversee finances. Expenditures exceeding PKR 5,000 require prior written EC approval. An internal audit of club finances shall be conducted at the end of each academic year.</w:t>
+        <w:t>Expenditures exceeding a baseline threshold</w:t>
+      </w:r>
+      <w:r>
+        <w:t xml:space="preserve">, </w:t>
+      </w:r>
+      <w:r>
+        <w:t>defined and voted upon by the EC at the start of each academic year</w:t>
+      </w:r>
+      <w:r>
+        <w:t xml:space="preserve">, </w:t>
+      </w:r>
+      <w:r>
+        <w:t>require prior written EC approval.</w:t>
+      </w:r>
+      <w:r>
+        <w:t xml:space="preserve"> An internal audit of club finances shall be conducted at the end of each academic year.</w:t>
       </w:r>
       <w:r>
         <w:t xml:space="preserve"> </w:t>
@@ -3451,13 +3501,9 @@
       <w:pPr>
         <w:spacing w:before="85" w:after="85"/>
         <w:ind w:left="113"/>
-        <w:jc w:val="both"/>
-      </w:pPr>
-      <w:r>
-        <w:t xml:space="preserve">The </w:t>
-      </w:r>
-      <w:r>
-        <w:t>VP</w:t>
+      </w:pPr>
+      <w:r>
+        <w:t>An EC member</w:t>
       </w:r>
       <w:r>
         <w:t xml:space="preserve"> shall record minutes for all formal EC meetings. Minutes must include decisions made</w:t>
@@ -3493,6 +3539,7 @@
           <w:sz w:val="28"/>
           <w:szCs w:val="28"/>
         </w:rPr>
+        <w:lastRenderedPageBreak/>
         <w:t xml:space="preserve">ARTICLE </w:t>
       </w:r>
       <w:r>
@@ -3553,6 +3600,67 @@
           <w:szCs w:val="24"/>
         </w:rPr>
         <w:t xml:space="preserve">   Mandatory Transition Protocol</w:t>
+      </w:r>
+    </w:p>
+    <w:p>
+      <w:pPr>
+        <w:spacing w:before="85" w:after="85"/>
+        <w:ind w:left="113"/>
+      </w:pPr>
+      <w:r>
+        <w:t xml:space="preserve">Outgoing </w:t>
+      </w:r>
+      <w:r>
+        <w:t>EC members</w:t>
+      </w:r>
+      <w:r>
+        <w:t xml:space="preserve"> must participate in a minimum 2-week structured handover. Every outgoing </w:t>
+      </w:r>
+      <w:r>
+        <w:t>EC member</w:t>
+      </w:r>
+      <w:r>
+        <w:t xml:space="preserve"> must submit a 'Transition Document' containing login credentials, project statuses, and vendor contacts to their successor.</w:t>
+      </w:r>
+      <w:r>
+        <w:rPr>
+          <w:b/>
+          <w:bCs/>
+          <w:color w:val="A31F34"/>
+          <w:sz w:val="24"/>
+          <w:szCs w:val="24"/>
+        </w:rPr>
+        <w:br/>
+      </w:r>
+      <w:r>
+        <w:rPr>
+          <w:b/>
+          <w:bCs/>
+          <w:color w:val="A31F34"/>
+          <w:sz w:val="24"/>
+          <w:szCs w:val="24"/>
+        </w:rPr>
+        <w:br/>
+      </w:r>
+      <w:r>
+        <w:rPr>
+          <w:b/>
+          <w:bCs/>
+          <w:color w:val="A31F34"/>
+          <w:sz w:val="24"/>
+          <w:szCs w:val="24"/>
+        </w:rPr>
+        <w:t>§ 13.2</w:t>
+      </w:r>
+      <w:r>
+        <w:rPr>
+          <w:b/>
+          <w:bCs/>
+          <w:color w:val="1F3F6D"/>
+          <w:sz w:val="24"/>
+          <w:szCs w:val="24"/>
+        </w:rPr>
+        <w:t xml:space="preserve">   Vacancy Protocol</w:t>
       </w:r>
     </w:p>
     <w:p>
@@ -3562,35 +3670,70 @@
         <w:jc w:val="both"/>
       </w:pPr>
       <w:r>
-        <w:t xml:space="preserve">Outgoing </w:t>
-      </w:r>
-      <w:r>
-        <w:t>EC members</w:t>
-      </w:r>
-      <w:r>
-        <w:t xml:space="preserve"> must participate in a minimum 2-week structured handover. Every outgoing </w:t>
+        <w:t xml:space="preserve">In the event of an </w:t>
       </w:r>
       <w:r>
         <w:t>EC member</w:t>
       </w:r>
       <w:r>
-        <w:t xml:space="preserve"> must submit a 'Transition Document' containing login credentials, project statuses, and vendor contacts to their successor.</w:t>
+        <w:t xml:space="preserve"> vacancy, the EC shall appoint an interim </w:t>
+      </w:r>
+      <w:r>
+        <w:t>EC member</w:t>
+      </w:r>
+      <w:r>
+        <w:t xml:space="preserve"> by</w:t>
+      </w:r>
+      <w:r>
+        <w:t xml:space="preserve"> majority vote</w:t>
+      </w:r>
+      <w:r>
+        <w:t xml:space="preserve"> until a permanent replacement is selected.</w:t>
       </w:r>
     </w:p>
     <w:p>
       <w:pPr>
         <w:spacing w:before="283" w:after="113"/>
-        <w:ind w:left="113"/>
-      </w:pPr>
-      <w:r>
-        <w:rPr>
-          <w:b/>
-          <w:bCs/>
-          <w:color w:val="A31F34"/>
-          <w:sz w:val="24"/>
-          <w:szCs w:val="24"/>
-        </w:rPr>
-        <w:t>§ 13.2</w:t>
+      </w:pPr>
+      <w:r>
+        <w:rPr>
+          <w:b/>
+          <w:bCs/>
+          <w:color w:val="A31F34"/>
+          <w:sz w:val="24"/>
+          <w:szCs w:val="24"/>
+        </w:rPr>
+        <w:t xml:space="preserve"> </w:t>
+      </w:r>
+      <w:r>
+        <w:rPr>
+          <w:b/>
+          <w:bCs/>
+          <w:color w:val="A31F34"/>
+          <w:sz w:val="24"/>
+          <w:szCs w:val="24"/>
+        </w:rPr>
+        <w:t xml:space="preserve"> </w:t>
+      </w:r>
+      <w:r>
+        <w:rPr>
+          <w:b/>
+          <w:bCs/>
+          <w:color w:val="A31F34"/>
+          <w:sz w:val="24"/>
+          <w:szCs w:val="24"/>
+        </w:rPr>
+        <w:t xml:space="preserve">§ </w:t>
+      </w:r>
+      <w:r>
+        <w:rPr>
+          <w:b/>
+          <w:bCs/>
+          <w:color w:val="A31F34"/>
+          <w:sz w:val="24"/>
+          <w:szCs w:val="24"/>
+        </w:rPr>
+        <w:t>13.3</w:t>
       </w:r>
       <w:r>
         <w:rPr>
@@ -3600,7 +3743,17 @@
           <w:sz w:val="24"/>
           <w:szCs w:val="24"/>
         </w:rPr>
-        <w:t xml:space="preserve">   Vacancy Protocol</w:t>
+        <w:t xml:space="preserve"> Handover</w:t>
+      </w:r>
+      <w:r>
+        <w:rPr>
+          <w:b/>
+          <w:bCs/>
+          <w:color w:val="1F3F6D"/>
+          <w:sz w:val="24"/>
+          <w:szCs w:val="24"/>
+        </w:rPr>
+        <w:t xml:space="preserve"> Acknowledgment &amp; Rulebook Continuity</w:t>
       </w:r>
     </w:p>
     <w:p>
@@ -3608,94 +3761,100 @@
         <w:spacing w:before="85" w:after="85"/>
         <w:ind w:left="113"/>
         <w:jc w:val="both"/>
-      </w:pPr>
-      <w:r>
-        <w:t xml:space="preserve">In the event of an officer vacancy, the EC shall appoint an interim </w:t>
-      </w:r>
-      <w:r>
-        <w:t>EC member</w:t>
-      </w:r>
-      <w:r>
-        <w:t xml:space="preserve"> by</w:t>
-      </w:r>
-      <w:r>
-        <w:t xml:space="preserve"> majority vote</w:t>
-      </w:r>
-      <w:r>
-        <w:t xml:space="preserve"> until a permanent replacement is selected.</w:t>
-      </w:r>
-    </w:p>
-    <w:p>
-      <w:pPr>
-        <w:spacing w:before="283" w:after="113"/>
-      </w:pPr>
-      <w:r>
-        <w:rPr>
-          <w:b/>
-          <w:bCs/>
-          <w:color w:val="A31F34"/>
-          <w:sz w:val="24"/>
-          <w:szCs w:val="24"/>
-        </w:rPr>
-        <w:lastRenderedPageBreak/>
-        <w:t xml:space="preserve"> </w:t>
-      </w:r>
-      <w:r>
-        <w:rPr>
-          <w:b/>
-          <w:bCs/>
-          <w:color w:val="A31F34"/>
-          <w:sz w:val="24"/>
-          <w:szCs w:val="24"/>
-        </w:rPr>
-        <w:t xml:space="preserve">§ </w:t>
-      </w:r>
-      <w:r>
-        <w:rPr>
-          <w:b/>
-          <w:bCs/>
-          <w:color w:val="A31F34"/>
-          <w:sz w:val="24"/>
-          <w:szCs w:val="24"/>
-        </w:rPr>
-        <w:t>13.3</w:t>
-      </w:r>
-      <w:r>
-        <w:rPr>
-          <w:b/>
-          <w:bCs/>
-          <w:color w:val="1F3F6D"/>
-          <w:sz w:val="24"/>
-          <w:szCs w:val="24"/>
-        </w:rPr>
-        <w:t xml:space="preserve"> Handover</w:t>
-      </w:r>
-      <w:r>
-        <w:rPr>
-          <w:b/>
-          <w:bCs/>
-          <w:color w:val="1F3F6D"/>
-          <w:sz w:val="24"/>
-          <w:szCs w:val="24"/>
-        </w:rPr>
-        <w:t xml:space="preserve"> Acknowledgment &amp; Rulebook Continuity</w:t>
-      </w:r>
-    </w:p>
-    <w:p>
-      <w:pPr>
-        <w:spacing w:before="85" w:after="85"/>
-        <w:ind w:left="113"/>
-        <w:jc w:val="both"/>
-      </w:pPr>
-      <w:r>
-        <w:t xml:space="preserve">The official Club Rulebook does not require annual re-ratification or re-signing by incoming leadership unless formal amendments are made. Instead, to ensure continuity and accountability, every incoming Executive Committee member must sign a one-page Handover Acknowledgment document during the transition period. This document shall state: </w:t>
-      </w:r>
-      <w:r>
         <w:rPr>
           <w:i/>
           <w:iCs/>
         </w:rPr>
+      </w:pPr>
+      <w:r>
+        <w:t xml:space="preserve">The official Club Rulebook does not require annual re-ratification or re-signing by incoming leadership unless formal amendments are made. Instead, to ensure continuity and accountability, every incoming Executive Committee member must sign a one-page Handover Acknowledgment document during the transition period. This document shall state: </w:t>
+      </w:r>
+      <w:r>
+        <w:rPr>
+          <w:i/>
+          <w:iCs/>
+        </w:rPr>
         <w:t>"I have received, read, and agree to govern Microsoft Club GIKI in strict accordance with the official Club Rulebook."</w:t>
+      </w:r>
+    </w:p>
+    <w:p>
+      <w:pPr>
+        <w:spacing w:before="283" w:after="113"/>
+      </w:pPr>
+      <w:r>
+        <w:rPr>
+          <w:b/>
+          <w:bCs/>
+          <w:color w:val="A31F34"/>
+          <w:sz w:val="24"/>
+          <w:szCs w:val="24"/>
+        </w:rPr>
+        <w:t xml:space="preserve">  </w:t>
+      </w:r>
+      <w:r>
+        <w:rPr>
+          <w:b/>
+          <w:bCs/>
+          <w:color w:val="A31F34"/>
+          <w:sz w:val="24"/>
+          <w:szCs w:val="24"/>
+        </w:rPr>
+        <w:t>§ 13.</w:t>
+      </w:r>
+      <w:r>
+        <w:rPr>
+          <w:b/>
+          <w:bCs/>
+          <w:color w:val="A31F34"/>
+          <w:sz w:val="24"/>
+          <w:szCs w:val="24"/>
+        </w:rPr>
+        <w:t>4</w:t>
+      </w:r>
+      <w:r>
+        <w:rPr>
+          <w:b/>
+          <w:bCs/>
+          <w:color w:val="1F3F6D"/>
+          <w:sz w:val="24"/>
+          <w:szCs w:val="24"/>
+        </w:rPr>
+        <w:t xml:space="preserve"> </w:t>
+      </w:r>
+      <w:r>
+        <w:rPr>
+          <w:b/>
+          <w:bCs/>
+          <w:color w:val="1F3F6D"/>
+          <w:sz w:val="24"/>
+          <w:szCs w:val="24"/>
+        </w:rPr>
+        <w:t>Version Control &amp; Transparency</w:t>
+      </w:r>
+    </w:p>
+    <w:p>
+      <w:pPr>
+        <w:spacing w:before="283" w:after="113"/>
+        <w:ind w:left="226"/>
+        <w:jc w:val="both"/>
+      </w:pPr>
+      <w:r>
+        <w:t xml:space="preserve">The official Club Rulebook and all ratified signed PDFs shall be maintained in the Club's official repository under the Microsoft GIKI GitHub organization. The </w:t>
+      </w:r>
+      <w:r>
+        <w:t>Active Wings Registry</w:t>
+      </w:r>
+      <w:r>
+        <w:t xml:space="preserve"> shall be maintained as a separate Google Doc owned by the Club's official email address. During the transition period, outgoing EC members must ensure that incoming EC members are granted write access to the GitHub repository and edit access to the </w:t>
+      </w:r>
+      <w:r>
+        <w:t>Active Wings Registry</w:t>
+      </w:r>
+      <w:r>
+        <w:t xml:space="preserve"> </w:t>
+      </w:r>
+      <w:r>
+        <w:t>Google Doc. Failure to transfer access constitutes an incomplete handover under § 13.1.</w:t>
       </w:r>
     </w:p>
     <w:p>
@@ -3829,10 +3988,15 @@
       <w:pPr>
         <w:spacing w:before="85" w:after="85"/>
         <w:ind w:left="113"/>
-        <w:jc w:val="both"/>
       </w:pPr>
       <w:r>
         <w:t>The Club shall maintain an Alumni Directory. This directory is strictly confidential and may not be used for personal commercial solicitation.</w:t>
+      </w:r>
+      <w:r>
+        <w:br/>
+      </w:r>
+      <w:r>
+        <w:br/>
       </w:r>
     </w:p>
     <w:p>
@@ -3853,6 +4017,7 @@
           <w:sz w:val="28"/>
           <w:szCs w:val="28"/>
         </w:rPr>
+        <w:lastRenderedPageBreak/>
         <w:t xml:space="preserve">ARTICLE </w:t>
       </w:r>
       <w:r>
@@ -3902,12 +4067,67 @@
     </w:p>
     <w:p>
       <w:pPr>
-        <w:spacing w:before="85" w:after="85"/>
+        <w:spacing w:before="283" w:after="113"/>
         <w:ind w:left="113"/>
-        <w:jc w:val="both"/>
-      </w:pPr>
+      </w:pPr>
+      <w:r>
+        <w:rPr>
+          <w:b/>
+          <w:bCs/>
+          <w:color w:val="A31F34"/>
+          <w:sz w:val="24"/>
+          <w:szCs w:val="24"/>
+        </w:rPr>
+        <w:t>§ 1</w:t>
+      </w:r>
+      <w:r>
+        <w:rPr>
+          <w:b/>
+          <w:bCs/>
+          <w:color w:val="A31F34"/>
+          <w:sz w:val="24"/>
+          <w:szCs w:val="24"/>
+        </w:rPr>
+        <w:t>5</w:t>
+      </w:r>
+      <w:r>
+        <w:rPr>
+          <w:b/>
+          <w:bCs/>
+          <w:color w:val="A31F34"/>
+          <w:sz w:val="24"/>
+          <w:szCs w:val="24"/>
+        </w:rPr>
+        <w:t>.1</w:t>
+      </w:r>
+      <w:r>
+        <w:rPr>
+          <w:b/>
+          <w:bCs/>
+          <w:color w:val="1F3F6D"/>
+          <w:sz w:val="24"/>
+          <w:szCs w:val="24"/>
+        </w:rPr>
+        <w:t xml:space="preserve">   </w:t>
+      </w:r>
+      <w:r>
+        <w:rPr>
+          <w:b/>
+          <w:bCs/>
+          <w:color w:val="1F3F6D"/>
+          <w:sz w:val="24"/>
+          <w:szCs w:val="24"/>
+        </w:rPr>
+        <w:t>Role &amp; Authority</w:t>
+      </w:r>
+      <w:r>
+        <w:br/>
+      </w:r>
       <w:r>
         <w:t>We maintain a Faculty Advisor from GIKI's permanent faculty to serve as our mentor and advocate within the university. While they assist us with institutional approvals and provide valuable guidance, the Executive Committee retains full voting authority over all internal club decisions.</w:t>
+      </w:r>
+      <w:r>
+        <w:br/>
       </w:r>
     </w:p>
     <w:p>
@@ -4017,7 +4237,7 @@
         <w:t xml:space="preserve"> and </w:t>
       </w:r>
       <w:r>
-        <w:t>volunteers’</w:t>
+        <w:t>volunteers</w:t>
       </w:r>
       <w:r>
         <w:t xml:space="preserve"> harmless</w:t>
@@ -4063,18 +4283,6 @@
       </w:r>
       <w:r>
         <w:t>.</w:t>
-      </w:r>
-    </w:p>
-    <w:p>
-      <w:pPr>
-        <w:spacing w:before="85" w:after="85"/>
-        <w:jc w:val="both"/>
-      </w:pPr>
-      <w:r>
-        <w:br/>
-      </w:r>
-      <w:r>
-        <w:br/>
       </w:r>
     </w:p>
     <w:p>
@@ -4095,7 +4303,6 @@
           <w:sz w:val="28"/>
           <w:szCs w:val="28"/>
         </w:rPr>
-        <w:lastRenderedPageBreak/>
         <w:t xml:space="preserve">ARTICLE </w:t>
       </w:r>
       <w:r>
@@ -4300,7 +4507,13 @@
         <w:t>solely</w:t>
       </w:r>
       <w:r>
-        <w:t xml:space="preserve"> on the active votes cast within the timeframe, provided that a minimum quorum of at least two (2) EC members have participated in the vote.</w:t>
+        <w:t xml:space="preserve"> on the active votes cast within the timeframe, provided that a minimum quorum of at least two (</w:t>
+      </w:r>
+      <w:r>
+        <w:t>3</w:t>
+      </w:r>
+      <w:r>
+        <w:t>) EC members have participated in the vote.</w:t>
       </w:r>
     </w:p>
     <w:p>
@@ -4316,6 +4529,7 @@
           <w:sz w:val="24"/>
           <w:szCs w:val="24"/>
         </w:rPr>
+        <w:lastRenderedPageBreak/>
         <w:t>§ 17.</w:t>
       </w:r>
       <w:r>
@@ -4361,19 +4575,22 @@
       <w:r>
         <w:t>In the event of a tied Executive Committee vote, the President holds the final tie-breaking vote.</w:t>
       </w:r>
-    </w:p>
-    <w:p>
-      <w:pPr>
-        <w:ind w:firstLine="226"/>
+      <w:r>
+        <w:br/>
+      </w:r>
+      <w:r>
+        <w:rPr>
+          <w:i/>
+          <w:iCs/>
+        </w:rPr>
+        <w:br/>
+      </w:r>
+      <w:r>
         <w:rPr>
           <w:color w:val="5C6475"/>
         </w:rPr>
-      </w:pPr>
-    </w:p>
-    <w:p>
-      <w:pPr>
-        <w:ind w:firstLine="226"/>
-      </w:pPr>
+        <w:br/>
+      </w:r>
       <w:r>
         <w:rPr>
           <w:color w:val="5C6475"/>
@@ -4685,10 +4902,16 @@
         <w:noProof/>
       </w:rPr>
       <w:drawing>
-        <wp:inline distT="0" distB="0" distL="0" distR="0" wp14:anchorId="3C63DFE6" wp14:editId="55D08B29">
+        <wp:inline distT="0" distB="0" distL="0" distR="0" wp14:anchorId="41B01A51" wp14:editId="1BEE7842">
           <wp:extent cx="941705" cy="617146"/>
           <wp:effectExtent l="0" t="0" r="0" b="0"/>
-          <wp:docPr id="1280908839" name="Picture 1"/>
+          <wp:docPr id="1280908839" name="Picture 1">
+            <a:extLst xmlns:a="http://schemas.openxmlformats.org/drawingml/2006/main">
+              <a:ext uri="{FF2B5EF4-FFF2-40B4-BE49-F238E27FC236}">
+                <a16:creationId xmlns:a16="http://schemas.microsoft.com/office/drawing/2014/main" id="{8B60973D-F287-44BE-B0E2-EC88A00DC8A1}"/>
+              </a:ext>
+            </a:extLst>
+          </wp:docPr>
           <wp:cNvGraphicFramePr>
             <a:graphicFrameLocks xmlns:a="http://schemas.openxmlformats.org/drawingml/2006/main" noChangeAspect="1"/>
           </wp:cNvGraphicFramePr>
@@ -4846,9 +5069,9 @@
     </w:lvl>
   </w:abstractNum>
   <w:abstractNum w:abstractNumId="1" w15:restartNumberingAfterBreak="0">
-    <w:nsid w:val="3989726B"/>
+    <w:nsid w:val="33C13902"/>
     <w:multiLevelType w:val="multilevel"/>
-    <w:tmpl w:val="658AD0E8"/>
+    <w:tmpl w:val="7F241AAE"/>
     <w:lvl w:ilvl="0">
       <w:start w:val="1"/>
       <w:numFmt w:val="bullet"/>
@@ -4865,7 +5088,7 @@
         <w:sz w:val="20"/>
       </w:rPr>
     </w:lvl>
-    <w:lvl w:ilvl="1">
+    <w:lvl w:ilvl="1" w:tentative="1">
       <w:start w:val="1"/>
       <w:numFmt w:val="bullet"/>
       <w:lvlText w:val="o"/>
@@ -4995,6 +5218,156 @@
     </w:lvl>
   </w:abstractNum>
   <w:abstractNum w:abstractNumId="2" w15:restartNumberingAfterBreak="0">
+    <w:nsid w:val="3989726B"/>
+    <w:multiLevelType w:val="multilevel"/>
+    <w:tmpl w:val="6C80C61E"/>
+    <w:lvl w:ilvl="0">
+      <w:start w:val="1"/>
+      <w:numFmt w:val="bullet"/>
+      <w:lvlText w:val=""/>
+      <w:lvlJc w:val="left"/>
+      <w:pPr>
+        <w:tabs>
+          <w:tab w:val="num" w:pos="720"/>
+        </w:tabs>
+        <w:ind w:left="720" w:hanging="360"/>
+      </w:pPr>
+      <w:rPr>
+        <w:rFonts w:ascii="Symbol" w:hAnsi="Symbol" w:hint="default"/>
+        <w:color w:val="EE0000"/>
+        <w:sz w:val="20"/>
+      </w:rPr>
+    </w:lvl>
+    <w:lvl w:ilvl="1">
+      <w:start w:val="1"/>
+      <w:numFmt w:val="bullet"/>
+      <w:lvlText w:val="o"/>
+      <w:lvlJc w:val="left"/>
+      <w:pPr>
+        <w:tabs>
+          <w:tab w:val="num" w:pos="1440"/>
+        </w:tabs>
+        <w:ind w:left="1440" w:hanging="360"/>
+      </w:pPr>
+      <w:rPr>
+        <w:rFonts w:ascii="Courier New" w:hAnsi="Courier New" w:hint="default"/>
+        <w:sz w:val="20"/>
+      </w:rPr>
+    </w:lvl>
+    <w:lvl w:ilvl="2" w:tentative="1">
+      <w:start w:val="1"/>
+      <w:numFmt w:val="bullet"/>
+      <w:lvlText w:val=""/>
+      <w:lvlJc w:val="left"/>
+      <w:pPr>
+        <w:tabs>
+          <w:tab w:val="num" w:pos="2160"/>
+        </w:tabs>
+        <w:ind w:left="2160" w:hanging="360"/>
+      </w:pPr>
+      <w:rPr>
+        <w:rFonts w:ascii="Wingdings" w:hAnsi="Wingdings" w:hint="default"/>
+        <w:sz w:val="20"/>
+      </w:rPr>
+    </w:lvl>
+    <w:lvl w:ilvl="3" w:tentative="1">
+      <w:start w:val="1"/>
+      <w:numFmt w:val="bullet"/>
+      <w:lvlText w:val=""/>
+      <w:lvlJc w:val="left"/>
+      <w:pPr>
+        <w:tabs>
+          <w:tab w:val="num" w:pos="2880"/>
+        </w:tabs>
+        <w:ind w:left="2880" w:hanging="360"/>
+      </w:pPr>
+      <w:rPr>
+        <w:rFonts w:ascii="Wingdings" w:hAnsi="Wingdings" w:hint="default"/>
+        <w:sz w:val="20"/>
+      </w:rPr>
+    </w:lvl>
+    <w:lvl w:ilvl="4" w:tentative="1">
+      <w:start w:val="1"/>
+      <w:numFmt w:val="bullet"/>
+      <w:lvlText w:val=""/>
+      <w:lvlJc w:val="left"/>
+      <w:pPr>
+        <w:tabs>
+          <w:tab w:val="num" w:pos="3600"/>
+        </w:tabs>
+        <w:ind w:left="3600" w:hanging="360"/>
+      </w:pPr>
+      <w:rPr>
+        <w:rFonts w:ascii="Wingdings" w:hAnsi="Wingdings" w:hint="default"/>
+        <w:sz w:val="20"/>
+      </w:rPr>
+    </w:lvl>
+    <w:lvl w:ilvl="5" w:tentative="1">
+      <w:start w:val="1"/>
+      <w:numFmt w:val="bullet"/>
+      <w:lvlText w:val=""/>
+      <w:lvlJc w:val="left"/>
+      <w:pPr>
+        <w:tabs>
+          <w:tab w:val="num" w:pos="4320"/>
+        </w:tabs>
+        <w:ind w:left="4320" w:hanging="360"/>
+      </w:pPr>
+      <w:rPr>
+        <w:rFonts w:ascii="Wingdings" w:hAnsi="Wingdings" w:hint="default"/>
+        <w:sz w:val="20"/>
+      </w:rPr>
+    </w:lvl>
+    <w:lvl w:ilvl="6" w:tentative="1">
+      <w:start w:val="1"/>
+      <w:numFmt w:val="bullet"/>
+      <w:lvlText w:val=""/>
+      <w:lvlJc w:val="left"/>
+      <w:pPr>
+        <w:tabs>
+          <w:tab w:val="num" w:pos="5040"/>
+        </w:tabs>
+        <w:ind w:left="5040" w:hanging="360"/>
+      </w:pPr>
+      <w:rPr>
+        <w:rFonts w:ascii="Wingdings" w:hAnsi="Wingdings" w:hint="default"/>
+        <w:sz w:val="20"/>
+      </w:rPr>
+    </w:lvl>
+    <w:lvl w:ilvl="7" w:tentative="1">
+      <w:start w:val="1"/>
+      <w:numFmt w:val="bullet"/>
+      <w:lvlText w:val=""/>
+      <w:lvlJc w:val="left"/>
+      <w:pPr>
+        <w:tabs>
+          <w:tab w:val="num" w:pos="5760"/>
+        </w:tabs>
+        <w:ind w:left="5760" w:hanging="360"/>
+      </w:pPr>
+      <w:rPr>
+        <w:rFonts w:ascii="Wingdings" w:hAnsi="Wingdings" w:hint="default"/>
+        <w:sz w:val="20"/>
+      </w:rPr>
+    </w:lvl>
+    <w:lvl w:ilvl="8" w:tentative="1">
+      <w:start w:val="1"/>
+      <w:numFmt w:val="bullet"/>
+      <w:lvlText w:val=""/>
+      <w:lvlJc w:val="left"/>
+      <w:pPr>
+        <w:tabs>
+          <w:tab w:val="num" w:pos="6480"/>
+        </w:tabs>
+        <w:ind w:left="6480" w:hanging="360"/>
+      </w:pPr>
+      <w:rPr>
+        <w:rFonts w:ascii="Wingdings" w:hAnsi="Wingdings" w:hint="default"/>
+        <w:sz w:val="20"/>
+      </w:rPr>
+    </w:lvl>
+  </w:abstractNum>
+  <w:abstractNum w:abstractNumId="3" w15:restartNumberingAfterBreak="0">
     <w:nsid w:val="3B6B42A9"/>
     <w:multiLevelType w:val="hybridMultilevel"/>
     <w:tmpl w:val="FA7C2FEE"/>
@@ -5080,17 +5453,172 @@
       </w:pPr>
     </w:lvl>
   </w:abstractNum>
+  <w:abstractNum w:abstractNumId="4" w15:restartNumberingAfterBreak="0">
+    <w:nsid w:val="4FCD39A0"/>
+    <w:multiLevelType w:val="multilevel"/>
+    <w:tmpl w:val="C3E81A0E"/>
+    <w:lvl w:ilvl="0">
+      <w:start w:val="1"/>
+      <w:numFmt w:val="bullet"/>
+      <w:lvlText w:val=""/>
+      <w:lvlJc w:val="left"/>
+      <w:pPr>
+        <w:tabs>
+          <w:tab w:val="num" w:pos="720"/>
+        </w:tabs>
+        <w:ind w:left="720" w:hanging="360"/>
+      </w:pPr>
+      <w:rPr>
+        <w:rFonts w:ascii="Symbol" w:hAnsi="Symbol" w:hint="default"/>
+        <w:sz w:val="20"/>
+      </w:rPr>
+    </w:lvl>
+    <w:lvl w:ilvl="1" w:tentative="1">
+      <w:start w:val="1"/>
+      <w:numFmt w:val="bullet"/>
+      <w:lvlText w:val="o"/>
+      <w:lvlJc w:val="left"/>
+      <w:pPr>
+        <w:tabs>
+          <w:tab w:val="num" w:pos="1440"/>
+        </w:tabs>
+        <w:ind w:left="1440" w:hanging="360"/>
+      </w:pPr>
+      <w:rPr>
+        <w:rFonts w:ascii="Courier New" w:hAnsi="Courier New" w:hint="default"/>
+        <w:sz w:val="20"/>
+      </w:rPr>
+    </w:lvl>
+    <w:lvl w:ilvl="2" w:tentative="1">
+      <w:start w:val="1"/>
+      <w:numFmt w:val="bullet"/>
+      <w:lvlText w:val=""/>
+      <w:lvlJc w:val="left"/>
+      <w:pPr>
+        <w:tabs>
+          <w:tab w:val="num" w:pos="2160"/>
+        </w:tabs>
+        <w:ind w:left="2160" w:hanging="360"/>
+      </w:pPr>
+      <w:rPr>
+        <w:rFonts w:ascii="Wingdings" w:hAnsi="Wingdings" w:hint="default"/>
+        <w:sz w:val="20"/>
+      </w:rPr>
+    </w:lvl>
+    <w:lvl w:ilvl="3" w:tentative="1">
+      <w:start w:val="1"/>
+      <w:numFmt w:val="bullet"/>
+      <w:lvlText w:val=""/>
+      <w:lvlJc w:val="left"/>
+      <w:pPr>
+        <w:tabs>
+          <w:tab w:val="num" w:pos="2880"/>
+        </w:tabs>
+        <w:ind w:left="2880" w:hanging="360"/>
+      </w:pPr>
+      <w:rPr>
+        <w:rFonts w:ascii="Wingdings" w:hAnsi="Wingdings" w:hint="default"/>
+        <w:sz w:val="20"/>
+      </w:rPr>
+    </w:lvl>
+    <w:lvl w:ilvl="4" w:tentative="1">
+      <w:start w:val="1"/>
+      <w:numFmt w:val="bullet"/>
+      <w:lvlText w:val=""/>
+      <w:lvlJc w:val="left"/>
+      <w:pPr>
+        <w:tabs>
+          <w:tab w:val="num" w:pos="3600"/>
+        </w:tabs>
+        <w:ind w:left="3600" w:hanging="360"/>
+      </w:pPr>
+      <w:rPr>
+        <w:rFonts w:ascii="Wingdings" w:hAnsi="Wingdings" w:hint="default"/>
+        <w:sz w:val="20"/>
+      </w:rPr>
+    </w:lvl>
+    <w:lvl w:ilvl="5" w:tentative="1">
+      <w:start w:val="1"/>
+      <w:numFmt w:val="bullet"/>
+      <w:lvlText w:val=""/>
+      <w:lvlJc w:val="left"/>
+      <w:pPr>
+        <w:tabs>
+          <w:tab w:val="num" w:pos="4320"/>
+        </w:tabs>
+        <w:ind w:left="4320" w:hanging="360"/>
+      </w:pPr>
+      <w:rPr>
+        <w:rFonts w:ascii="Wingdings" w:hAnsi="Wingdings" w:hint="default"/>
+        <w:sz w:val="20"/>
+      </w:rPr>
+    </w:lvl>
+    <w:lvl w:ilvl="6" w:tentative="1">
+      <w:start w:val="1"/>
+      <w:numFmt w:val="bullet"/>
+      <w:lvlText w:val=""/>
+      <w:lvlJc w:val="left"/>
+      <w:pPr>
+        <w:tabs>
+          <w:tab w:val="num" w:pos="5040"/>
+        </w:tabs>
+        <w:ind w:left="5040" w:hanging="360"/>
+      </w:pPr>
+      <w:rPr>
+        <w:rFonts w:ascii="Wingdings" w:hAnsi="Wingdings" w:hint="default"/>
+        <w:sz w:val="20"/>
+      </w:rPr>
+    </w:lvl>
+    <w:lvl w:ilvl="7" w:tentative="1">
+      <w:start w:val="1"/>
+      <w:numFmt w:val="bullet"/>
+      <w:lvlText w:val=""/>
+      <w:lvlJc w:val="left"/>
+      <w:pPr>
+        <w:tabs>
+          <w:tab w:val="num" w:pos="5760"/>
+        </w:tabs>
+        <w:ind w:left="5760" w:hanging="360"/>
+      </w:pPr>
+      <w:rPr>
+        <w:rFonts w:ascii="Wingdings" w:hAnsi="Wingdings" w:hint="default"/>
+        <w:sz w:val="20"/>
+      </w:rPr>
+    </w:lvl>
+    <w:lvl w:ilvl="8" w:tentative="1">
+      <w:start w:val="1"/>
+      <w:numFmt w:val="bullet"/>
+      <w:lvlText w:val=""/>
+      <w:lvlJc w:val="left"/>
+      <w:pPr>
+        <w:tabs>
+          <w:tab w:val="num" w:pos="6480"/>
+        </w:tabs>
+        <w:ind w:left="6480" w:hanging="360"/>
+      </w:pPr>
+      <w:rPr>
+        <w:rFonts w:ascii="Wingdings" w:hAnsi="Wingdings" w:hint="default"/>
+        <w:sz w:val="20"/>
+      </w:rPr>
+    </w:lvl>
+  </w:abstractNum>
   <w:num w:numId="1" w16cid:durableId="1937515100">
-    <w:abstractNumId w:val="1"/>
+    <w:abstractNumId w:val="2"/>
   </w:num>
   <w:num w:numId="2" w16cid:durableId="257830080">
-    <w:abstractNumId w:val="2"/>
+    <w:abstractNumId w:val="3"/>
     <w:lvlOverride w:ilvl="0">
       <w:startOverride w:val="1"/>
     </w:lvlOverride>
   </w:num>
   <w:num w:numId="3" w16cid:durableId="941691581">
     <w:abstractNumId w:val="0"/>
+  </w:num>
+  <w:num w:numId="4" w16cid:durableId="16587494">
+    <w:abstractNumId w:val="4"/>
+  </w:num>
+  <w:num w:numId="5" w16cid:durableId="126360907">
+    <w:abstractNumId w:val="1"/>
   </w:num>
 </w:numbering>
 </file>
@@ -5494,7 +6022,7 @@
   <w:style w:type="paragraph" w:default="1" w:styleId="Normal">
     <w:name w:val="Normal"/>
     <w:qFormat/>
-    <w:rsid w:val="00590931"/>
+    <w:rsid w:val="00B32556"/>
   </w:style>
   <w:style w:type="paragraph" w:styleId="Heading1">
     <w:name w:val="heading 1"/>
@@ -5583,7 +6111,6 @@
   <w:style w:type="character" w:default="1" w:styleId="DefaultParagraphFont">
     <w:name w:val="Default Paragraph Font"/>
     <w:uiPriority w:val="1"/>
-    <w:semiHidden/>
     <w:unhideWhenUsed/>
   </w:style>
   <w:style w:type="table" w:default="1" w:styleId="TableNormal">

</xml_diff>